<commit_message>
Preprint v1: justified text and colored PREPRINT legend
</commit_message>
<xml_diff>
--- a/Bourguet_2026_Ideological_Signatures_preprint_v1.docx
+++ b/Bourguet_2026_Ideological_Signatures_preprint_v1.docx
@@ -4,7 +4,30 @@
   <w:body>
     <w:p>
       <w:pPr>
+        <w:spacing w:after="200"/>
+        <w:jc w:val="left"/>
+        <w:shd w:val="clear" w:color="auto" w:fill="FBE9E1"/>
+        <w:pBdr>
+          <w:top w:val="single" w:sz="8" w:space="4" w:color="C8521E"/>
+          <w:left w:val="single" w:sz="8" w:space="4" w:color="C8521E"/>
+          <w:bottom w:val="single" w:sz="8" w:space="4" w:color="C8521E"/>
+          <w:right w:val="single" w:sz="8" w:space="4" w:color="C8521E"/>
+        </w:pBdr>
+      </w:pPr>
+      <w:r>
+        <w:rPr>
+          <w:rFonts w:ascii="Times New Roman" w:hAnsi="Times New Roman"/>
+          <w:b/>
+          <w:color w:val="C8521E"/>
+          <w:sz w:val="20"/>
+        </w:rPr>
+        <w:t>PREPRINT — VERSION 1 (15 OCTOBER 2026) — SUBMITTED TO THE JOURNAL OF SOCIAL ONTOLOGY — NOT YET PEER REVIEWED — CC BY 4.0</w:t>
+      </w:r>
+    </w:p>
+    <w:p>
+      <w:pPr>
         <w:pStyle w:val="FirstParagraph"/>
+        <w:jc w:val="both"/>
       </w:pPr>
       <w:r>
         <w:rPr>
@@ -17,6 +40,7 @@
     <w:p>
       <w:pPr>
         <w:pStyle w:val="BodyText"/>
+        <w:jc w:val="both"/>
       </w:pPr>
       <w:r>
         <w:t xml:space="preserve">Luis Felipe Bourguet González</w:t>
@@ -37,6 +61,7 @@
     <w:p>
       <w:pPr>
         <w:pStyle w:val="BodyText"/>
+        <w:jc w:val="both"/>
       </w:pPr>
       <w:r>
         <w:rPr>
@@ -91,6 +116,7 @@
     <w:p>
       <w:pPr>
         <w:pStyle w:val="BodyText"/>
+        <w:jc w:val="both"/>
       </w:pPr>
       <w:r>
         <w:rPr>
@@ -109,6 +135,7 @@
     <w:p>
       <w:pPr>
         <w:pStyle w:val="BodyText"/>
+        <w:jc w:val="both"/>
       </w:pPr>
       <w:r>
         <w:rPr>
@@ -136,6 +163,7 @@
     <w:p>
       <w:pPr>
         <w:pStyle w:val="FirstParagraph"/>
+        <w:jc w:val="both"/>
       </w:pPr>
       <w:r>
         <w:t xml:space="preserve">What individuates an ideology? By what criterion do we distinguish one ideological family from another, and a family from one of its variants? The question has rarely been asked as a question of social ontology — about what kind of thing an ideology is such that it can be told apart from its neighbors. This paper asks it in that form.</w:t>
@@ -144,6 +172,7 @@
     <w:p>
       <w:pPr>
         <w:pStyle w:val="BodyText"/>
+        <w:jc w:val="both"/>
       </w:pPr>
       <w:r>
         <w:t xml:space="preserve">The doctrinal criterion individuates an ideology by what it affirms: an ideology would be its body of doctrines. The criterion fails twice. Doctrines migrate across families — planning has inhabited socialism and fascism, the free market liberalism and certain authoritarianisms — so that no statement is the exclusive property of one family; and families survive radical doctrinal revision without losing their identity, as any history of socialism or conservatism shows. The morphological criterion, developed by Freeden (1996) and now the dominant approach in the field, refines the doctrinal one by shifting the locus of identity from contents to their arrangement: an ideology is a configuration of concepts — core, adjacent, peripheral — each of which it</w:t>
@@ -201,6 +230,7 @@
     <w:p>
       <w:pPr>
         <w:pStyle w:val="BodyText"/>
+        <w:jc w:val="both"/>
       </w:pPr>
       <w:r>
         <w:t xml:space="preserve">The thesis of this paper is that ideologies are individuated</w:t>
@@ -271,6 +301,7 @@
     <w:p>
       <w:pPr>
         <w:pStyle w:val="BodyText"/>
+        <w:jc w:val="both"/>
       </w:pPr>
       <w:r>
         <w:t xml:space="preserve">Three clarifications fix the scope of the claim. First,</w:t>
@@ -297,6 +328,7 @@
     <w:p>
       <w:pPr>
         <w:pStyle w:val="BodyText"/>
+        <w:jc w:val="both"/>
       </w:pPr>
       <w:r>
         <w:t xml:space="preserve">The argument proceeds as follows. Section 2 locates the proposal within a stratified account of social reality, specifies in what sense the account is emergentist, and uses the grounding/anchoring distinction to say which of its elements fix the frame and which fix a given ideology. Section 3 defines the matrix M = C × S, its twenty questions, and the weighting function ω. Section 4 defines the six operators as species of decontestation and gives, for each, the mechanism by which it is socially realized. Section 5 treats ideological families as historical kinds, states the protocol by which membership is established, and presents the signatures of ten families as hypotheses. Section 6 indicates how the apparatus extends from doctrines to institutional architectures. Section 7 specifies the estimation protocol and the observations that would disconfirm the conjectures. Section 8 concludes.</w:t>
@@ -315,6 +347,7 @@
     <w:p>
       <w:pPr>
         <w:pStyle w:val="FirstParagraph"/>
+        <w:jc w:val="both"/>
       </w:pPr>
       <w:r>
         <w:t xml:space="preserve">The formal system does not float. It presupposes a stratified account of symbolic reality developed in a companion paper (Bourguet González, under review), recalled here in the form needed to make the present essay self-contained and reformulated in the vocabulary of social ontology.</w:t>
@@ -323,6 +356,7 @@
     <w:p>
       <w:pPr>
         <w:pStyle w:val="BodyText"/>
+        <w:jc w:val="both"/>
       </w:pPr>
       <w:r>
         <w:rPr>
@@ -365,6 +399,7 @@
     <w:p>
       <w:pPr>
         <w:pStyle w:val="BodyText"/>
+        <w:jc w:val="both"/>
       </w:pPr>
       <w:r>
         <w:rPr>
@@ -541,6 +576,7 @@
     <w:p>
       <w:pPr>
         <w:pStyle w:val="BodyText"/>
+        <w:jc w:val="both"/>
       </w:pPr>
       <w:r>
         <w:rPr>
@@ -640,6 +676,7 @@
     <w:p>
       <w:pPr>
         <w:pStyle w:val="BodyText"/>
+        <w:jc w:val="both"/>
       </w:pPr>
       <w:r>
         <w:t xml:space="preserve">The vertical reading of the strata is the argument itself (Fig. 1). A conflict (stratum 1) is thematized by symbolic forms (stratum 2), which distribute it over the material subsystems (stratum 3); an ideology (stratum 4) is the resulting trajectory of selection and weighting. The second stratum is the middle term of the construction: without it, the bond between conflict and doctrine remains either immediate — ideology as a direct response to need, the functionalist vice — or arbitrary — ideology as construction without substratum, the constructivist vice. The matrix defined next lives in stratum 2: it is the product of symbolic mediation, not an artifact of the theorist.</w:t>
@@ -648,6 +685,7 @@
     <w:p>
       <w:pPr>
         <w:pStyle w:val="BodyText"/>
+        <w:jc w:val="both"/>
       </w:pPr>
       <w:r>
         <w:drawing>
@@ -695,6 +733,7 @@
     <w:p>
       <w:pPr>
         <w:pStyle w:val="BodyText"/>
+        <w:jc w:val="both"/>
       </w:pPr>
       <w:r>
         <w:rPr>
@@ -717,6 +756,7 @@
     <w:p>
       <w:pPr>
         <w:pStyle w:val="FirstParagraph"/>
+        <w:jc w:val="both"/>
       </w:pPr>
       <w:r>
         <w:t xml:space="preserve">Let M = C × S be the matrix crossing the five existential conflicts with the four subsystems. Each of its twenty cells (i, j) contains what we call an</w:t>
@@ -1240,6 +1280,7 @@
     <w:p>
       <w:pPr>
         <w:pStyle w:val="BodyText"/>
+        <w:jc w:val="both"/>
       </w:pPr>
       <w:r>
         <w:rPr>
@@ -1252,6 +1293,7 @@
     <w:p>
       <w:pPr>
         <w:pStyle w:val="BodyText"/>
+        <w:jc w:val="both"/>
       </w:pPr>
       <w:r>
         <w:rPr>
@@ -1286,6 +1328,7 @@
     <w:p>
       <w:pPr>
         <w:pStyle w:val="BodyText"/>
+        <w:jc w:val="both"/>
       </w:pPr>
       <w:r>
         <w:rPr>
@@ -1376,6 +1419,7 @@
     <w:p>
       <w:pPr>
         <w:pStyle w:val="BodyText"/>
+        <w:jc w:val="both"/>
       </w:pPr>
       <w:r>
         <w:rPr>
@@ -1412,6 +1456,7 @@
     <w:p>
       <w:pPr>
         <w:pStyle w:val="BodyText"/>
+        <w:jc w:val="both"/>
       </w:pPr>
       <w:r>
         <w:rPr>
@@ -1511,6 +1556,7 @@
     <w:p>
       <w:pPr>
         <w:pStyle w:val="BodyText"/>
+        <w:jc w:val="both"/>
       </w:pPr>
       <w:r>
         <w:t xml:space="preserve">The definition has an immediate corollary. Since all the cells exist in every society, what varies is not the grid but the distribution over it. Two ideologies are not distinguished by the questions that exist in their world but by the weight they assign to each and, more deeply, by the transformations they impose on the grid itself. Those transformations are the object of the next section.</w:t>
@@ -1529,6 +1575,7 @@
     <w:p>
       <w:pPr>
         <w:pStyle w:val="FirstParagraph"/>
+        <w:jc w:val="both"/>
       </w:pPr>
       <w:r>
         <w:t xml:space="preserve">The distribution ω is the state; the operators are the dynamics. The constraints between cells are what a flat table does not show: every ideology executes them, none declares them. We call</w:t>
@@ -1553,6 +1600,7 @@
     <w:p>
       <w:pPr>
         <w:pStyle w:val="BodyText"/>
+        <w:jc w:val="both"/>
       </w:pPr>
       <w:r>
         <w:rPr>
@@ -1657,6 +1705,7 @@
     <w:p>
       <w:pPr>
         <w:pStyle w:val="BodyText"/>
+        <w:jc w:val="both"/>
       </w:pPr>
       <w:r>
         <w:rPr>
@@ -2109,6 +2158,7 @@
     <w:p>
       <w:pPr>
         <w:pStyle w:val="BodyText"/>
+        <w:jc w:val="both"/>
       </w:pPr>
       <w:r>
         <w:rPr>
@@ -2121,6 +2171,7 @@
     <w:p>
       <w:pPr>
         <w:pStyle w:val="BodyText"/>
+        <w:jc w:val="both"/>
       </w:pPr>
       <w:r>
         <w:rPr>
@@ -2139,6 +2190,7 @@
     <w:p>
       <w:pPr>
         <w:pStyle w:val="BodyText"/>
+        <w:jc w:val="both"/>
       </w:pPr>
       <w:r>
         <w:rPr>
@@ -2227,6 +2279,7 @@
     <w:p>
       <w:pPr>
         <w:pStyle w:val="BodyText"/>
+        <w:jc w:val="both"/>
       </w:pPr>
       <w:r>
         <w:rPr>
@@ -2350,6 +2403,7 @@
     <w:p>
       <w:pPr>
         <w:pStyle w:val="BodyText"/>
+        <w:jc w:val="both"/>
       </w:pPr>
       <w:r>
         <w:rPr>
@@ -2422,6 +2476,7 @@
     <w:p>
       <w:pPr>
         <w:pStyle w:val="BodyText"/>
+        <w:jc w:val="both"/>
       </w:pPr>
       <w:r>
         <w:rPr>
@@ -2489,6 +2544,7 @@
     <w:p>
       <w:pPr>
         <w:pStyle w:val="BodyText"/>
+        <w:jc w:val="both"/>
       </w:pPr>
       <w:r>
         <w:rPr>
@@ -2507,6 +2563,7 @@
     <w:p>
       <w:pPr>
         <w:pStyle w:val="BodyText"/>
+        <w:jc w:val="both"/>
       </w:pPr>
       <w:r>
         <w:rPr>
@@ -2571,6 +2628,7 @@
     <w:p>
       <w:pPr>
         <w:pStyle w:val="FirstParagraph"/>
+        <w:jc w:val="both"/>
       </w:pPr>
       <w:r>
         <w:t xml:space="preserve">We define the</w:t>
@@ -2595,6 +2653,7 @@
     <w:p>
       <w:pPr>
         <w:pStyle w:val="BodyText"/>
+        <w:jc w:val="both"/>
       </w:pPr>
       <w:r>
         <w:rPr>
@@ -2747,6 +2806,7 @@
     <w:p>
       <w:pPr>
         <w:pStyle w:val="BodyText"/>
+        <w:jc w:val="both"/>
       </w:pPr>
       <w:r>
         <w:rPr>
@@ -2819,6 +2879,7 @@
     <w:p>
       <w:pPr>
         <w:pStyle w:val="BodyText"/>
+        <w:jc w:val="both"/>
       </w:pPr>
       <w:r>
         <w:rPr>
@@ -3580,6 +3641,7 @@
     <w:p>
       <w:pPr>
         <w:pStyle w:val="BodyText"/>
+        <w:jc w:val="both"/>
       </w:pPr>
       <w:r>
         <w:rPr>
@@ -3592,6 +3654,7 @@
     <w:p>
       <w:pPr>
         <w:pStyle w:val="BodyText"/>
+        <w:jc w:val="both"/>
       </w:pPr>
       <w:r>
         <w:drawing>
@@ -3639,6 +3702,7 @@
     <w:p>
       <w:pPr>
         <w:pStyle w:val="BodyText"/>
+        <w:jc w:val="both"/>
       </w:pPr>
       <w:r>
         <w:rPr>
@@ -3651,6 +3715,7 @@
     <w:p>
       <w:pPr>
         <w:pStyle w:val="BodyText"/>
+        <w:jc w:val="both"/>
       </w:pPr>
       <w:r>
         <w:t xml:space="preserve">Four entries illustrate how the readings are generated.</w:t>
@@ -3723,6 +3788,7 @@
     <w:p>
       <w:pPr>
         <w:pStyle w:val="BodyText"/>
+        <w:jc w:val="both"/>
       </w:pPr>
       <w:r>
         <w:rPr>
@@ -3913,6 +3979,7 @@
     <w:p>
       <w:pPr>
         <w:pStyle w:val="BodyText"/>
+        <w:jc w:val="both"/>
       </w:pPr>
       <w:r>
         <w:rPr>
@@ -3984,6 +4051,7 @@
     <w:p>
       <w:pPr>
         <w:pStyle w:val="BodyText"/>
+        <w:jc w:val="both"/>
       </w:pPr>
       <w:r>
         <w:drawing>
@@ -4031,6 +4099,7 @@
     <w:p>
       <w:pPr>
         <w:pStyle w:val="BodyText"/>
+        <w:jc w:val="both"/>
       </w:pPr>
       <w:r>
         <w:rPr>
@@ -4043,6 +4112,7 @@
     <w:p>
       <w:pPr>
         <w:pStyle w:val="BodyText"/>
+        <w:jc w:val="both"/>
       </w:pPr>
       <w:r>
         <w:rPr>
@@ -4119,6 +4189,7 @@
     <w:p>
       <w:pPr>
         <w:pStyle w:val="FirstParagraph"/>
+        <w:jc w:val="both"/>
       </w:pPr>
       <w:r>
         <w:t xml:space="preserve">Of the six operators, scission has a particular status: doctrines undergo it, institutional architectures institutionalize it. When one and the same conflict receives incompatible answers in two subsystems — or when two ideological fields divide the functions of one subsystem between them — the resulting configuration resists any single family name, and the resistance is the surface symptom of distinct mechanisms: a scission can be held by a superordinate norm, by consensus, by an arbiter internal to one of the fields, by an arbiter external to both, or by nothing at all. The apparatus of Sections 3–5 extends to such architectures without modification: a state’s configuration is a vector of belief fields, one per occupied subsystem, and its topology is the set of scissions between them, read on constitutional documents rather than on doctrinal corpora. The extension is a separate study, because it changes the unit of analysis and the evidence; the comparative dimensions along which one signature varies across formations — factional, dominant versus subaltern, ethnogeographic, historical (Ostrowski 2026) — are its proper axes. What the present paper contributes to it is the operator, and one claim that the comparative study must test: that the stability of a scission depends not on the existence of an arbiter but on the geometry of the fracture — whether it runs between conflicts or within one row of the matrix.</w:t>
@@ -4137,6 +4208,7 @@
     <w:p>
       <w:pPr>
         <w:pStyle w:val="FirstParagraph"/>
+        <w:jc w:val="both"/>
       </w:pPr>
       <w:r>
         <w:t xml:space="preserve">The ω profile and the chain are not quantitative metaphors. They can be estimated, and the estimation is where the conjectures of Section 5 become answerable. This section specifies the protocol, builds it on a published method, states its known limits, and names the observations that would disconfirm the signatures.</w:t>
@@ -4145,6 +4217,7 @@
     <w:p>
       <w:pPr>
         <w:pStyle w:val="BodyText"/>
+        <w:jc w:val="both"/>
       </w:pPr>
       <w:r>
         <w:rPr>
@@ -4196,6 +4269,7 @@
     <w:p>
       <w:pPr>
         <w:pStyle w:val="BodyText"/>
+        <w:jc w:val="both"/>
       </w:pPr>
       <w:r>
         <w:rPr>
@@ -4307,6 +4381,7 @@
     <w:p>
       <w:pPr>
         <w:pStyle w:val="BodyText"/>
+        <w:jc w:val="both"/>
       </w:pPr>
       <w:r>
         <w:rPr>
@@ -4362,6 +4437,7 @@
     <w:p>
       <w:pPr>
         <w:pStyle w:val="BodyText"/>
+        <w:jc w:val="both"/>
       </w:pPr>
       <w:r>
         <w:rPr>
@@ -4434,6 +4510,7 @@
     <w:p>
       <w:pPr>
         <w:pStyle w:val="BodyText"/>
+        <w:jc w:val="both"/>
       </w:pPr>
       <w:r>
         <w:rPr>
@@ -4513,6 +4590,7 @@
     <w:p>
       <w:pPr>
         <w:pStyle w:val="FirstParagraph"/>
+        <w:jc w:val="both"/>
       </w:pPr>
       <w:r>
         <w:t xml:space="preserve">What, then, individuates an ideology? Not its doctrinal body, which migrates and undergoes revision; not the arrangement of its concepts alone, which remains internal to what it says; not the distribution of its attention alone, which opposite formations can share; but the pair ⟨ω, chain⟩: where a family spends its hermeneutic budget, and what it does to the topology of the questions it did not author. The criterion is grid-relative, comparative, and estimable, and its objects — weights and operators — are not constructions of the analyst but traces that the operation leaves because it acts on a material that precedes it.</w:t>
@@ -4521,6 +4599,7 @@
     <w:p>
       <w:pPr>
         <w:pStyle w:val="BodyText"/>
+        <w:jc w:val="both"/>
       </w:pPr>
       <w:r>
         <w:t xml:space="preserve">It is worth stating, in closing, what has been argued and what has not. Argued: that the doctrinal and morphological criteria underdetermine identity, and that a grid-relative criterion does not; that the operators are species of decontestation with specifiable mechanisms, and that a signature constrains through the norm circles that back it and the telic power of its ideals; that the strata are regimes of constraint rather than entities, and that the account survives the fictionalist’s and the naturalist’s objections at that price; that the signature is the pair and not one of its members. Proposed: the matrix, the bound on ω, the six operators, the estimation protocol. Conjectured: the ten signatures of Table 3, the polarity of fascism and feminisms, the compatibility of the revelation operators with every host. The function that defines an ideology — selection and weighting over the grid — individuates what kind of thing an ideology is; it does not predict which signature a given lineage will have, and no theoretical argument can (Larue 2025, 233, 237). That is what the protocol is for.</w:t>
@@ -4529,6 +4608,7 @@
     <w:p>
       <w:pPr>
         <w:pStyle w:val="BodyText"/>
+        <w:jc w:val="both"/>
       </w:pPr>
       <w:r>
         <w:t xml:space="preserve">The most general result concerns conflict. If ideologies were different answers to the same questions, ideological conflict would in principle be composable by argument. The signatures show otherwise: ideologies do not clash primarily over answers — they clash over the topology of the matrix, over which questions exist, which are one and the same, which are resolved by nature, and which must not be posed. Whoever has translated a question cannot discuss it in its original form; whoever has naturalized it no longer sees it as a question; whoever has silenced it lacks the grammar to receive it. Arguing presupposes sharing the question, and it is precisely the question that signatures do not share. Hence the rarely argumentative character of ideological struggle, and its typical forms: not refutation, but revelation — reopening a cell — or conversion — changing chains. Ideological conflict is, at its deepest stratum, a conflict over the topology of the discussable; a theory that makes it estimable does not dissolve it, but it makes it recognizable for what it is.</w:t>
@@ -4547,6 +4627,7 @@
     <w:p>
       <w:pPr>
         <w:pStyle w:val="FirstParagraph"/>
+        <w:jc w:val="both"/>
       </w:pPr>
       <w:r>
         <w:t xml:space="preserve">C1–C5: the five existential conflicts (survival, belonging, order, meaning, transformation). S1–S4: the four social subsystems (biological, economic, political, cultural). M = C × S: the matrix of twenty cells (i, j). ω: the weighting function of a formation over the cells, Σ ω_ij = 1. ⇒ translation; ⊕ fusion; ↓ S naturalization (toward subsystem S); ∅ silencing; ✦ revelation; ∥ scission. ⟨ω, chain⟩: the signature of a family (weighting and operator chain). I = ⟨C, S, D, G, B, A, P, V, I, O, M⟩: Romero’s belief field (community, society, domain, worldview, background knowledge, doctrinal body with core A_core, problems, values, ideals, objectives, methods).</w:t>
@@ -4565,6 +4646,7 @@
     <w:p>
       <w:pPr>
         <w:pStyle w:val="FirstParagraph"/>
+        <w:jc w:val="both"/>
       </w:pPr>
       <w:r>
         <w:t xml:space="preserve">Arendt, Hannah. 1958.</w:t>
@@ -4586,6 +4668,7 @@
     <w:p>
       <w:pPr>
         <w:pStyle w:val="BodyText"/>
+        <w:jc w:val="both"/>
       </w:pPr>
       <w:r>
         <w:t xml:space="preserve">Bach, Theodore. 2016.</w:t>
@@ -4622,6 +4705,7 @@
     <w:p>
       <w:pPr>
         <w:pStyle w:val="BodyText"/>
+        <w:jc w:val="both"/>
       </w:pPr>
       <w:r>
         <w:t xml:space="preserve">Barthes, Roland. 1957.</w:t>
@@ -4643,6 +4727,7 @@
     <w:p>
       <w:pPr>
         <w:pStyle w:val="BodyText"/>
+        <w:jc w:val="both"/>
       </w:pPr>
       <w:r>
         <w:t xml:space="preserve">Bourdieu, Pierre. 1980.</w:t>
@@ -4664,6 +4749,7 @@
     <w:p>
       <w:pPr>
         <w:pStyle w:val="BodyText"/>
+        <w:jc w:val="both"/>
       </w:pPr>
       <w:r>
         <w:t xml:space="preserve">Bourguet González, Luis Felipe. Under review.</w:t>
@@ -4703,6 +4789,7 @@
     <w:p>
       <w:pPr>
         <w:pStyle w:val="BodyText"/>
+        <w:jc w:val="both"/>
       </w:pPr>
       <w:r>
         <w:t xml:space="preserve">Brännmark, Johan. 2026.</w:t>
@@ -4739,6 +4826,7 @@
     <w:p>
       <w:pPr>
         <w:pStyle w:val="BodyText"/>
+        <w:jc w:val="both"/>
       </w:pPr>
       <w:r>
         <w:t xml:space="preserve">Bunge, Mario. 1979.</w:t>
@@ -4773,6 +4861,7 @@
     <w:p>
       <w:pPr>
         <w:pStyle w:val="BodyText"/>
+        <w:jc w:val="both"/>
       </w:pPr>
       <w:r>
         <w:t xml:space="preserve">Burman, Åsa. 2023.</w:t>
@@ -4794,6 +4883,7 @@
     <w:p>
       <w:pPr>
         <w:pStyle w:val="BodyText"/>
+        <w:jc w:val="both"/>
       </w:pPr>
       <w:r>
         <w:t xml:space="preserve">Cassirer, Ernst. 1923–1929.</w:t>
@@ -4815,6 +4905,7 @@
     <w:p>
       <w:pPr>
         <w:pStyle w:val="BodyText"/>
+        <w:jc w:val="both"/>
       </w:pPr>
       <w:r>
         <w:t xml:space="preserve">Castoriadis, Cornelius. 1975.</w:t>
@@ -4836,6 +4927,7 @@
     <w:p>
       <w:pPr>
         <w:pStyle w:val="BodyText"/>
+        <w:jc w:val="both"/>
       </w:pPr>
       <w:r>
         <w:t xml:space="preserve">De Cleen, Benjamin. 2018.</w:t>
@@ -4872,6 +4964,7 @@
     <w:p>
       <w:pPr>
         <w:pStyle w:val="BodyText"/>
+        <w:jc w:val="both"/>
       </w:pPr>
       <w:r>
         <w:t xml:space="preserve">Elder-Vass, Dave. 2015.</w:t>
@@ -4908,6 +5001,7 @@
     <w:p>
       <w:pPr>
         <w:pStyle w:val="BodyText"/>
+        <w:jc w:val="both"/>
       </w:pPr>
       <w:r>
         <w:t xml:space="preserve">Epstein, Brian. 2015.</w:t>
@@ -4929,6 +5023,7 @@
     <w:p>
       <w:pPr>
         <w:pStyle w:val="BodyText"/>
+        <w:jc w:val="both"/>
       </w:pPr>
       <w:r>
         <w:t xml:space="preserve">Epstein, Brian. 2016.</w:t>
@@ -4993,6 +5088,7 @@
     <w:p>
       <w:pPr>
         <w:pStyle w:val="BodyText"/>
+        <w:jc w:val="both"/>
       </w:pPr>
       <w:r>
         <w:t xml:space="preserve">Ferraris, Maurizio. 2012.</w:t>
@@ -5014,6 +5110,7 @@
     <w:p>
       <w:pPr>
         <w:pStyle w:val="BodyText"/>
+        <w:jc w:val="both"/>
       </w:pPr>
       <w:r>
         <w:t xml:space="preserve">Ferraris, Maurizio. 2016.</w:t>
@@ -5035,6 +5132,7 @@
     <w:p>
       <w:pPr>
         <w:pStyle w:val="BodyText"/>
+        <w:jc w:val="both"/>
       </w:pPr>
       <w:r>
         <w:t xml:space="preserve">Franks, Benjamin. 2016.</w:t>
@@ -5071,6 +5169,7 @@
     <w:p>
       <w:pPr>
         <w:pStyle w:val="BodyText"/>
+        <w:jc w:val="both"/>
       </w:pPr>
       <w:r>
         <w:t xml:space="preserve">Freeden, Michael. 1996.</w:t>
@@ -5092,6 +5191,7 @@
     <w:p>
       <w:pPr>
         <w:pStyle w:val="BodyText"/>
+        <w:jc w:val="both"/>
       </w:pPr>
       <w:r>
         <w:t xml:space="preserve">Freeden, Michael. 1998.</w:t>
@@ -5128,6 +5228,7 @@
     <w:p>
       <w:pPr>
         <w:pStyle w:val="BodyText"/>
+        <w:jc w:val="both"/>
       </w:pPr>
       <w:r>
         <w:t xml:space="preserve">Geertz, Clifford. 1973.</w:t>
@@ -5149,6 +5250,7 @@
     <w:p>
       <w:pPr>
         <w:pStyle w:val="BodyText"/>
+        <w:jc w:val="both"/>
       </w:pPr>
       <w:r>
         <w:t xml:space="preserve">Gramsci, Antonio. 1975.</w:t>
@@ -5170,6 +5272,7 @@
     <w:p>
       <w:pPr>
         <w:pStyle w:val="BodyText"/>
+        <w:jc w:val="both"/>
       </w:pPr>
       <w:r>
         <w:t xml:space="preserve">Grimmer, Justin, and Brandon M. Stewart. 2013.</w:t>
@@ -5206,6 +5309,7 @@
     <w:p>
       <w:pPr>
         <w:pStyle w:val="BodyText"/>
+        <w:jc w:val="both"/>
       </w:pPr>
       <w:r>
         <w:t xml:space="preserve">Gulì, Sandro, and Luca Moretti. 2025.</w:t>
@@ -5242,6 +5346,7 @@
     <w:p>
       <w:pPr>
         <w:pStyle w:val="BodyText"/>
+        <w:jc w:val="both"/>
       </w:pPr>
       <w:r>
         <w:t xml:space="preserve">Hacking, Ian. 1995.</w:t>
@@ -5281,6 +5386,7 @@
     <w:p>
       <w:pPr>
         <w:pStyle w:val="BodyText"/>
+        <w:jc w:val="both"/>
       </w:pPr>
       <w:r>
         <w:t xml:space="preserve">Humphrey, Mathew. 2000.</w:t>
@@ -5329,6 +5435,7 @@
     <w:p>
       <w:pPr>
         <w:pStyle w:val="BodyText"/>
+        <w:jc w:val="both"/>
       </w:pPr>
       <w:r>
         <w:t xml:space="preserve">Kaidesoja, Tuukka. 2015.</w:t>
@@ -5378,6 +5485,7 @@
     <w:p>
       <w:pPr>
         <w:pStyle w:val="BodyText"/>
+        <w:jc w:val="both"/>
       </w:pPr>
       <w:r>
         <w:t xml:space="preserve">Kofoed Hansen, Christian. 2026.</w:t>
@@ -5411,6 +5519,7 @@
     <w:p>
       <w:pPr>
         <w:pStyle w:val="BodyText"/>
+        <w:jc w:val="both"/>
       </w:pPr>
       <w:r>
         <w:t xml:space="preserve">Langer, Susanne K. 1942.</w:t>
@@ -5432,6 +5541,7 @@
     <w:p>
       <w:pPr>
         <w:pStyle w:val="BodyText"/>
+        <w:jc w:val="both"/>
       </w:pPr>
       <w:r>
         <w:t xml:space="preserve">Jankowski, Michael, Sebastian Schneider, and Markus Tepe. 2023.</w:t>
@@ -5501,6 +5611,7 @@
     <w:p>
       <w:pPr>
         <w:pStyle w:val="BodyText"/>
+        <w:jc w:val="both"/>
       </w:pPr>
       <w:r>
         <w:t xml:space="preserve">Larue, Louis. 2025.</w:t>
@@ -5537,6 +5648,7 @@
     <w:p>
       <w:pPr>
         <w:pStyle w:val="BodyText"/>
+        <w:jc w:val="both"/>
       </w:pPr>
       <w:r>
         <w:t xml:space="preserve">Laver, Michael, Kenneth Benoit, and John Garry. 2003.</w:t>
@@ -5573,6 +5685,7 @@
     <w:p>
       <w:pPr>
         <w:pStyle w:val="BodyText"/>
+        <w:jc w:val="both"/>
       </w:pPr>
       <w:r>
         <w:t xml:space="preserve">Levine, Peter. 2024.</w:t>
@@ -5609,6 +5722,7 @@
     <w:p>
       <w:pPr>
         <w:pStyle w:val="BodyText"/>
+        <w:jc w:val="both"/>
       </w:pPr>
       <w:r>
         <w:t xml:space="preserve">Malinowski, Bronisław. 1944.</w:t>
@@ -5630,6 +5744,7 @@
     <w:p>
       <w:pPr>
         <w:pStyle w:val="BodyText"/>
+        <w:jc w:val="both"/>
       </w:pPr>
       <w:r>
         <w:t xml:space="preserve">Onnis, Erica. 2021.</w:t>
@@ -5651,6 +5766,7 @@
     <w:p>
       <w:pPr>
         <w:pStyle w:val="BodyText"/>
+        <w:jc w:val="both"/>
       </w:pPr>
       <w:r>
         <w:t xml:space="preserve">Ostrowski, Marius S. 2023.</w:t>
@@ -5687,6 +5803,7 @@
     <w:p>
       <w:pPr>
         <w:pStyle w:val="BodyText"/>
+        <w:jc w:val="both"/>
       </w:pPr>
       <w:r>
         <w:t xml:space="preserve">Ostrowski, Marius S. 2025.</w:t>
@@ -5723,6 +5840,7 @@
     <w:p>
       <w:pPr>
         <w:pStyle w:val="BodyText"/>
+        <w:jc w:val="both"/>
       </w:pPr>
       <w:r>
         <w:t xml:space="preserve">Ostrowski, Marius S. 2026.</w:t>
@@ -5759,6 +5877,7 @@
     <w:p>
       <w:pPr>
         <w:pStyle w:val="BodyText"/>
+        <w:jc w:val="both"/>
       </w:pPr>
       <w:r>
         <w:t xml:space="preserve">Peirce, Charles S. 1992.</w:t>
@@ -5780,6 +5899,7 @@
     <w:p>
       <w:pPr>
         <w:pStyle w:val="BodyText"/>
+        <w:jc w:val="both"/>
       </w:pPr>
       <w:r>
         <w:t xml:space="preserve">Romero, Gustavo E. 2025.</w:t>
@@ -5819,6 +5939,7 @@
     <w:p>
       <w:pPr>
         <w:pStyle w:val="BodyText"/>
+        <w:jc w:val="both"/>
       </w:pPr>
       <w:r>
         <w:t xml:space="preserve">Simon, Herbert A. 1971.</w:t>
@@ -5858,6 +5979,7 @@
     <w:p>
       <w:pPr>
         <w:pStyle w:val="BodyText"/>
+        <w:jc w:val="both"/>
       </w:pPr>
       <w:r>
         <w:t xml:space="preserve">Stanley, Ben. 2008.</w:t>
@@ -5894,6 +6016,7 @@
     <w:p>
       <w:pPr>
         <w:pStyle w:val="BodyText"/>
+        <w:jc w:val="both"/>
       </w:pPr>
       <w:r>
         <w:t xml:space="preserve">Sucaet, Peter. 2026.</w:t>
@@ -5930,6 +6053,7 @@
     <w:p>
       <w:pPr>
         <w:pStyle w:val="BodyText"/>
+        <w:jc w:val="both"/>
       </w:pPr>
       <w:r>
         <w:t xml:space="preserve">Turunen, Risto. 2026.</w:t>
@@ -5966,6 +6090,7 @@
     <w:p>
       <w:pPr>
         <w:pStyle w:val="BodyText"/>
+        <w:jc w:val="both"/>
       </w:pPr>
       <w:r>
         <w:t xml:space="preserve">Wilson, Lee. 2021.</w:t>
@@ -6002,6 +6127,7 @@
     <w:p>
       <w:pPr>
         <w:pStyle w:val="BodyText"/>
+        <w:jc w:val="both"/>
       </w:pPr>
       <w:r>
         <w:t xml:space="preserve">Wimsatt, William C. 2007.</w:t>
@@ -6023,6 +6149,7 @@
     <w:bookmarkEnd w:id="43"/>
     <w:sectPr>
       <w:footerReference r:id="rId9" w:type="default"/>
+      <w:headerReference w:type="default" r:id="rId10"/>
     </w:sectPr>
   </w:body>
 </w:document>
@@ -6198,6 +6325,26 @@
 </w:footnotes>
 </file>
 
+<file path=word/header1.xml><?xml version="1.0" encoding="utf-8"?>
+<w:hdr xmlns:m="http://schemas.openxmlformats.org/officeDocument/2006/math" xmlns:mc="http://schemas.openxmlformats.org/markup-compatibility/2006" xmlns:mo="http://schemas.microsoft.com/office/mac/office/2008/main" xmlns:mv="urn:schemas-microsoft-com:mac:vml" xmlns:o="urn:schemas-microsoft-com:office:office" xmlns:r="http://schemas.openxmlformats.org/officeDocument/2006/relationships" xmlns:v="urn:schemas-microsoft-com:vml" xmlns:w10="urn:schemas-microsoft-com:office:word" xmlns:w14="http://schemas.microsoft.com/office/word/2010/wordml" xmlns:w="http://schemas.openxmlformats.org/wordprocessingml/2006/main" xmlns:wne="http://schemas.microsoft.com/office/word/2006/wordml" xmlns:wp14="http://schemas.microsoft.com/office/word/2010/wordprocessingDrawing" xmlns:wp="http://schemas.openxmlformats.org/drawingml/2006/wordprocessingDrawing" xmlns:wpc="http://schemas.microsoft.com/office/word/2010/wordprocessingCanvas" xmlns:wpg="http://schemas.microsoft.com/office/word/2010/wordprocessingGroup" xmlns:wpi="http://schemas.microsoft.com/office/word/2010/wordprocessingInk" xmlns:wps="http://schemas.microsoft.com/office/word/2010/wordprocessingShape" mc:Ignorable="w14 wp14">
+  <w:p>
+    <w:pPr>
+      <w:pStyle w:val="Header"/>
+      <w:jc w:val="right"/>
+    </w:pPr>
+    <w:r/>
+    <w:r>
+      <w:rPr>
+        <w:rFonts w:ascii="Times New Roman" w:hAnsi="Times New Roman"/>
+        <w:color w:val="C8521E"/>
+        <w:sz w:val="16"/>
+      </w:rPr>
+      <w:t>PREPRINT · not peer reviewed · submitted to the Journal of Social Ontology, October 2026</w:t>
+    </w:r>
+  </w:p>
+</w:hdr>
+</file>
+
 <file path=word/numbering.xml><?xml version="1.0" encoding="utf-8"?>
 <w:numbering xmlns:w="http://schemas.openxmlformats.org/wordprocessingml/2006/main">
   <w:abstractNum w:abstractNumId="990">
@@ -6305,7 +6452,7 @@
     <w:qFormat/>
     <w:pPr>
       <w:spacing w:after="120" w:before="0" w:line="240" w:lineRule="auto"/>
-      <w:jc w:val="left"/>
+      <w:jc w:val="both"/>
     </w:pPr>
     <w:rPr>
       <w:rFonts w:ascii="Times New Roman" w:cs="Times New Roman" w:eastAsia="Times New Roman" w:hAnsi="Times New Roman"/>
@@ -6318,7 +6465,7 @@
     <w:link w:val="BodyTextChar"/>
     <w:pPr>
       <w:spacing w:after="120" w:before="0" w:line="240" w:lineRule="auto"/>
-      <w:jc w:val="left"/>
+      <w:jc w:val="both"/>
     </w:pPr>
     <w:qFormat/>
     <w:rPr>
@@ -6333,7 +6480,7 @@
     <w:qFormat/>
     <w:pPr>
       <w:spacing w:after="120" w:before="0" w:line="240" w:lineRule="auto"/>
-      <w:jc w:val="left"/>
+      <w:jc w:val="both"/>
     </w:pPr>
     <w:rPr>
       <w:rFonts w:ascii="Times New Roman" w:cs="Times New Roman" w:eastAsia="Times New Roman" w:hAnsi="Times New Roman"/>
@@ -6346,7 +6493,7 @@
     <w:qFormat/>
     <w:pPr>
       <w:spacing w:after="120" w:before="0" w:line="240" w:lineRule="auto"/>
-      <w:jc w:val="left"/>
+      <w:jc w:val="both"/>
     </w:pPr>
     <w:rPr>
       <w:rFonts w:ascii="Times New Roman" w:cs="Times New Roman" w:eastAsia="Times New Roman" w:hAnsi="Times New Roman"/>
@@ -6648,7 +6795,7 @@
     <w:pPr>
       <w:spacing w:after="120" w:before="0" w:line="240" w:lineRule="auto"/>
       <w:ind w:firstLine="0" w:left="480" w:right="480"/>
-      <w:jc w:val="left"/>
+      <w:jc w:val="both"/>
     </w:pPr>
     <w:rPr>
       <w:rFonts w:ascii="Times New Roman" w:cs="Times New Roman" w:eastAsia="Times New Roman" w:hAnsi="Times New Roman"/>
@@ -6664,7 +6811,7 @@
     <w:qFormat/>
     <w:pPr>
       <w:spacing w:after="40" w:before="0" w:line="240" w:lineRule="auto"/>
-      <w:jc w:val="left"/>
+      <w:jc w:val="both"/>
     </w:pPr>
     <w:rPr>
       <w:rFonts w:ascii="Times New Roman" w:cs="Times New Roman" w:eastAsia="Times New Roman" w:hAnsi="Times New Roman"/>

</xml_diff>

<commit_message>
v1.0.1: Zenodo DOIs filled in (PDF banner, README, CITATION.cff)
</commit_message>
<xml_diff>
--- a/Bourguet_2026_Ideological_Signatures_preprint_v1.docx
+++ b/Bourguet_2026_Ideological_Signatures_preprint_v1.docx
@@ -21,13 +21,12 @@
           <w:color w:val="C8521E"/>
           <w:sz w:val="20"/>
         </w:rPr>
-        <w:t>PREPRINT — VERSION 1 (15 OCTOBER 2026) — SUBMITTED TO THE JOURNAL OF SOCIAL ONTOLOGY — NOT YET PEER REVIEWED — CC BY 4.0</w:t>
+        <w:t>PREPRINT — VERSION 1 (15 OCTOBER 2026) — SUBMITTED TO THE JOURNAL OF SOCIAL ONTOLOGY — NOT YET PEER REVIEWED — CC BY 4.0 — DOI 10.5281/zenodo.23387760</w:t>
       </w:r>
     </w:p>
     <w:p>
       <w:pPr>
         <w:pStyle w:val="FirstParagraph"/>
-        <w:jc w:val="both"/>
       </w:pPr>
       <w:r>
         <w:rPr>
@@ -40,7 +39,6 @@
     <w:p>
       <w:pPr>
         <w:pStyle w:val="BodyText"/>
-        <w:jc w:val="both"/>
       </w:pPr>
       <w:r>
         <w:t xml:space="preserve">Luis Felipe Bourguet González</w:t>
@@ -61,7 +59,6 @@
     <w:p>
       <w:pPr>
         <w:pStyle w:val="BodyText"/>
-        <w:jc w:val="both"/>
       </w:pPr>
       <w:r>
         <w:rPr>
@@ -110,13 +107,12 @@
           <w:iCs/>
           <w:i/>
         </w:rPr>
-        <w:t xml:space="preserve">Preprint. Zenodo. https://doi.org/[DOI assigned on deposit].</w:t>
-      </w:r>
-    </w:p>
-    <w:p>
-      <w:pPr>
-        <w:pStyle w:val="BodyText"/>
-        <w:jc w:val="both"/>
+        <w:t xml:space="preserve">Preprint. Zenodo. https://doi.org/10.5281/zenodo.23387760.</w:t>
+      </w:r>
+    </w:p>
+    <w:p>
+      <w:pPr>
+        <w:pStyle w:val="BodyText"/>
       </w:pPr>
       <w:r>
         <w:rPr>
@@ -135,7 +131,6 @@
     <w:p>
       <w:pPr>
         <w:pStyle w:val="BodyText"/>
-        <w:jc w:val="both"/>
       </w:pPr>
       <w:r>
         <w:rPr>
@@ -163,7 +158,6 @@
     <w:p>
       <w:pPr>
         <w:pStyle w:val="FirstParagraph"/>
-        <w:jc w:val="both"/>
       </w:pPr>
       <w:r>
         <w:t xml:space="preserve">What individuates an ideology? By what criterion do we distinguish one ideological family from another, and a family from one of its variants? The question has rarely been asked as a question of social ontology — about what kind of thing an ideology is such that it can be told apart from its neighbors. This paper asks it in that form.</w:t>
@@ -172,7 +166,6 @@
     <w:p>
       <w:pPr>
         <w:pStyle w:val="BodyText"/>
-        <w:jc w:val="both"/>
       </w:pPr>
       <w:r>
         <w:t xml:space="preserve">The doctrinal criterion individuates an ideology by what it affirms: an ideology would be its body of doctrines. The criterion fails twice. Doctrines migrate across families — planning has inhabited socialism and fascism, the free market liberalism and certain authoritarianisms — so that no statement is the exclusive property of one family; and families survive radical doctrinal revision without losing their identity, as any history of socialism or conservatism shows. The morphological criterion, developed by Freeden (1996) and now the dominant approach in the field, refines the doctrinal one by shifting the locus of identity from contents to their arrangement: an ideology is a configuration of concepts — core, adjacent, peripheral — each of which it</w:t>
@@ -230,7 +223,6 @@
     <w:p>
       <w:pPr>
         <w:pStyle w:val="BodyText"/>
-        <w:jc w:val="both"/>
       </w:pPr>
       <w:r>
         <w:t xml:space="preserve">The thesis of this paper is that ideologies are individuated</w:t>
@@ -301,7 +293,6 @@
     <w:p>
       <w:pPr>
         <w:pStyle w:val="BodyText"/>
-        <w:jc w:val="both"/>
       </w:pPr>
       <w:r>
         <w:t xml:space="preserve">Three clarifications fix the scope of the claim. First,</w:t>
@@ -328,7 +319,6 @@
     <w:p>
       <w:pPr>
         <w:pStyle w:val="BodyText"/>
-        <w:jc w:val="both"/>
       </w:pPr>
       <w:r>
         <w:t xml:space="preserve">The argument proceeds as follows. Section 2 locates the proposal within a stratified account of social reality, specifies in what sense the account is emergentist, and uses the grounding/anchoring distinction to say which of its elements fix the frame and which fix a given ideology. Section 3 defines the matrix M = C × S, its twenty questions, and the weighting function ω. Section 4 defines the six operators as species of decontestation and gives, for each, the mechanism by which it is socially realized. Section 5 treats ideological families as historical kinds, states the protocol by which membership is established, and presents the signatures of ten families as hypotheses. Section 6 indicates how the apparatus extends from doctrines to institutional architectures. Section 7 specifies the estimation protocol and the observations that would disconfirm the conjectures. Section 8 concludes.</w:t>
@@ -347,7 +337,6 @@
     <w:p>
       <w:pPr>
         <w:pStyle w:val="FirstParagraph"/>
-        <w:jc w:val="both"/>
       </w:pPr>
       <w:r>
         <w:t xml:space="preserve">The formal system does not float. It presupposes a stratified account of symbolic reality developed in a companion paper (Bourguet González, under review), recalled here in the form needed to make the present essay self-contained and reformulated in the vocabulary of social ontology.</w:t>
@@ -356,7 +345,6 @@
     <w:p>
       <w:pPr>
         <w:pStyle w:val="BodyText"/>
-        <w:jc w:val="both"/>
       </w:pPr>
       <w:r>
         <w:rPr>
@@ -399,7 +387,6 @@
     <w:p>
       <w:pPr>
         <w:pStyle w:val="BodyText"/>
-        <w:jc w:val="both"/>
       </w:pPr>
       <w:r>
         <w:rPr>
@@ -576,7 +563,6 @@
     <w:p>
       <w:pPr>
         <w:pStyle w:val="BodyText"/>
-        <w:jc w:val="both"/>
       </w:pPr>
       <w:r>
         <w:rPr>
@@ -676,7 +662,6 @@
     <w:p>
       <w:pPr>
         <w:pStyle w:val="BodyText"/>
-        <w:jc w:val="both"/>
       </w:pPr>
       <w:r>
         <w:t xml:space="preserve">The vertical reading of the strata is the argument itself (Fig. 1). A conflict (stratum 1) is thematized by symbolic forms (stratum 2), which distribute it over the material subsystems (stratum 3); an ideology (stratum 4) is the resulting trajectory of selection and weighting. The second stratum is the middle term of the construction: without it, the bond between conflict and doctrine remains either immediate — ideology as a direct response to need, the functionalist vice — or arbitrary — ideology as construction without substratum, the constructivist vice. The matrix defined next lives in stratum 2: it is the product of symbolic mediation, not an artifact of the theorist.</w:t>
@@ -685,7 +670,6 @@
     <w:p>
       <w:pPr>
         <w:pStyle w:val="BodyText"/>
-        <w:jc w:val="both"/>
       </w:pPr>
       <w:r>
         <w:drawing>
@@ -733,7 +717,6 @@
     <w:p>
       <w:pPr>
         <w:pStyle w:val="BodyText"/>
-        <w:jc w:val="both"/>
       </w:pPr>
       <w:r>
         <w:rPr>
@@ -756,7 +739,6 @@
     <w:p>
       <w:pPr>
         <w:pStyle w:val="FirstParagraph"/>
-        <w:jc w:val="both"/>
       </w:pPr>
       <w:r>
         <w:t xml:space="preserve">Let M = C × S be the matrix crossing the five existential conflicts with the four subsystems. Each of its twenty cells (i, j) contains what we call an</w:t>
@@ -1280,7 +1262,6 @@
     <w:p>
       <w:pPr>
         <w:pStyle w:val="BodyText"/>
-        <w:jc w:val="both"/>
       </w:pPr>
       <w:r>
         <w:rPr>
@@ -1293,7 +1274,6 @@
     <w:p>
       <w:pPr>
         <w:pStyle w:val="BodyText"/>
-        <w:jc w:val="both"/>
       </w:pPr>
       <w:r>
         <w:rPr>
@@ -1328,7 +1308,6 @@
     <w:p>
       <w:pPr>
         <w:pStyle w:val="BodyText"/>
-        <w:jc w:val="both"/>
       </w:pPr>
       <w:r>
         <w:rPr>
@@ -1419,7 +1398,6 @@
     <w:p>
       <w:pPr>
         <w:pStyle w:val="BodyText"/>
-        <w:jc w:val="both"/>
       </w:pPr>
       <w:r>
         <w:rPr>
@@ -1456,7 +1434,6 @@
     <w:p>
       <w:pPr>
         <w:pStyle w:val="BodyText"/>
-        <w:jc w:val="both"/>
       </w:pPr>
       <w:r>
         <w:rPr>
@@ -1556,7 +1533,6 @@
     <w:p>
       <w:pPr>
         <w:pStyle w:val="BodyText"/>
-        <w:jc w:val="both"/>
       </w:pPr>
       <w:r>
         <w:t xml:space="preserve">The definition has an immediate corollary. Since all the cells exist in every society, what varies is not the grid but the distribution over it. Two ideologies are not distinguished by the questions that exist in their world but by the weight they assign to each and, more deeply, by the transformations they impose on the grid itself. Those transformations are the object of the next section.</w:t>
@@ -1575,7 +1551,6 @@
     <w:p>
       <w:pPr>
         <w:pStyle w:val="FirstParagraph"/>
-        <w:jc w:val="both"/>
       </w:pPr>
       <w:r>
         <w:t xml:space="preserve">The distribution ω is the state; the operators are the dynamics. The constraints between cells are what a flat table does not show: every ideology executes them, none declares them. We call</w:t>
@@ -1600,7 +1575,6 @@
     <w:p>
       <w:pPr>
         <w:pStyle w:val="BodyText"/>
-        <w:jc w:val="both"/>
       </w:pPr>
       <w:r>
         <w:rPr>
@@ -1705,7 +1679,6 @@
     <w:p>
       <w:pPr>
         <w:pStyle w:val="BodyText"/>
-        <w:jc w:val="both"/>
       </w:pPr>
       <w:r>
         <w:rPr>
@@ -2158,7 +2131,6 @@
     <w:p>
       <w:pPr>
         <w:pStyle w:val="BodyText"/>
-        <w:jc w:val="both"/>
       </w:pPr>
       <w:r>
         <w:rPr>
@@ -2171,7 +2143,6 @@
     <w:p>
       <w:pPr>
         <w:pStyle w:val="BodyText"/>
-        <w:jc w:val="both"/>
       </w:pPr>
       <w:r>
         <w:rPr>
@@ -2190,7 +2161,6 @@
     <w:p>
       <w:pPr>
         <w:pStyle w:val="BodyText"/>
-        <w:jc w:val="both"/>
       </w:pPr>
       <w:r>
         <w:rPr>
@@ -2279,7 +2249,6 @@
     <w:p>
       <w:pPr>
         <w:pStyle w:val="BodyText"/>
-        <w:jc w:val="both"/>
       </w:pPr>
       <w:r>
         <w:rPr>
@@ -2403,7 +2372,6 @@
     <w:p>
       <w:pPr>
         <w:pStyle w:val="BodyText"/>
-        <w:jc w:val="both"/>
       </w:pPr>
       <w:r>
         <w:rPr>
@@ -2476,7 +2444,6 @@
     <w:p>
       <w:pPr>
         <w:pStyle w:val="BodyText"/>
-        <w:jc w:val="both"/>
       </w:pPr>
       <w:r>
         <w:rPr>
@@ -2544,7 +2511,6 @@
     <w:p>
       <w:pPr>
         <w:pStyle w:val="BodyText"/>
-        <w:jc w:val="both"/>
       </w:pPr>
       <w:r>
         <w:rPr>
@@ -2563,7 +2529,6 @@
     <w:p>
       <w:pPr>
         <w:pStyle w:val="BodyText"/>
-        <w:jc w:val="both"/>
       </w:pPr>
       <w:r>
         <w:rPr>
@@ -2628,7 +2593,6 @@
     <w:p>
       <w:pPr>
         <w:pStyle w:val="FirstParagraph"/>
-        <w:jc w:val="both"/>
       </w:pPr>
       <w:r>
         <w:t xml:space="preserve">We define the</w:t>
@@ -2653,7 +2617,6 @@
     <w:p>
       <w:pPr>
         <w:pStyle w:val="BodyText"/>
-        <w:jc w:val="both"/>
       </w:pPr>
       <w:r>
         <w:rPr>
@@ -2806,7 +2769,6 @@
     <w:p>
       <w:pPr>
         <w:pStyle w:val="BodyText"/>
-        <w:jc w:val="both"/>
       </w:pPr>
       <w:r>
         <w:rPr>
@@ -2879,7 +2841,6 @@
     <w:p>
       <w:pPr>
         <w:pStyle w:val="BodyText"/>
-        <w:jc w:val="both"/>
       </w:pPr>
       <w:r>
         <w:rPr>
@@ -3641,7 +3602,6 @@
     <w:p>
       <w:pPr>
         <w:pStyle w:val="BodyText"/>
-        <w:jc w:val="both"/>
       </w:pPr>
       <w:r>
         <w:rPr>
@@ -3654,7 +3614,6 @@
     <w:p>
       <w:pPr>
         <w:pStyle w:val="BodyText"/>
-        <w:jc w:val="both"/>
       </w:pPr>
       <w:r>
         <w:drawing>
@@ -3702,7 +3661,6 @@
     <w:p>
       <w:pPr>
         <w:pStyle w:val="BodyText"/>
-        <w:jc w:val="both"/>
       </w:pPr>
       <w:r>
         <w:rPr>
@@ -3715,7 +3673,6 @@
     <w:p>
       <w:pPr>
         <w:pStyle w:val="BodyText"/>
-        <w:jc w:val="both"/>
       </w:pPr>
       <w:r>
         <w:t xml:space="preserve">Four entries illustrate how the readings are generated.</w:t>
@@ -3788,7 +3745,6 @@
     <w:p>
       <w:pPr>
         <w:pStyle w:val="BodyText"/>
-        <w:jc w:val="both"/>
       </w:pPr>
       <w:r>
         <w:rPr>
@@ -3979,7 +3935,6 @@
     <w:p>
       <w:pPr>
         <w:pStyle w:val="BodyText"/>
-        <w:jc w:val="both"/>
       </w:pPr>
       <w:r>
         <w:rPr>
@@ -4051,7 +4006,6 @@
     <w:p>
       <w:pPr>
         <w:pStyle w:val="BodyText"/>
-        <w:jc w:val="both"/>
       </w:pPr>
       <w:r>
         <w:drawing>
@@ -4099,7 +4053,6 @@
     <w:p>
       <w:pPr>
         <w:pStyle w:val="BodyText"/>
-        <w:jc w:val="both"/>
       </w:pPr>
       <w:r>
         <w:rPr>
@@ -4112,7 +4065,6 @@
     <w:p>
       <w:pPr>
         <w:pStyle w:val="BodyText"/>
-        <w:jc w:val="both"/>
       </w:pPr>
       <w:r>
         <w:rPr>
@@ -4189,7 +4141,6 @@
     <w:p>
       <w:pPr>
         <w:pStyle w:val="FirstParagraph"/>
-        <w:jc w:val="both"/>
       </w:pPr>
       <w:r>
         <w:t xml:space="preserve">Of the six operators, scission has a particular status: doctrines undergo it, institutional architectures institutionalize it. When one and the same conflict receives incompatible answers in two subsystems — or when two ideological fields divide the functions of one subsystem between them — the resulting configuration resists any single family name, and the resistance is the surface symptom of distinct mechanisms: a scission can be held by a superordinate norm, by consensus, by an arbiter internal to one of the fields, by an arbiter external to both, or by nothing at all. The apparatus of Sections 3–5 extends to such architectures without modification: a state’s configuration is a vector of belief fields, one per occupied subsystem, and its topology is the set of scissions between them, read on constitutional documents rather than on doctrinal corpora. The extension is a separate study, because it changes the unit of analysis and the evidence; the comparative dimensions along which one signature varies across formations — factional, dominant versus subaltern, ethnogeographic, historical (Ostrowski 2026) — are its proper axes. What the present paper contributes to it is the operator, and one claim that the comparative study must test: that the stability of a scission depends not on the existence of an arbiter but on the geometry of the fracture — whether it runs between conflicts or within one row of the matrix.</w:t>
@@ -4208,7 +4159,6 @@
     <w:p>
       <w:pPr>
         <w:pStyle w:val="FirstParagraph"/>
-        <w:jc w:val="both"/>
       </w:pPr>
       <w:r>
         <w:t xml:space="preserve">The ω profile and the chain are not quantitative metaphors. They can be estimated, and the estimation is where the conjectures of Section 5 become answerable. This section specifies the protocol, builds it on a published method, states its known limits, and names the observations that would disconfirm the signatures.</w:t>
@@ -4217,7 +4167,6 @@
     <w:p>
       <w:pPr>
         <w:pStyle w:val="BodyText"/>
-        <w:jc w:val="both"/>
       </w:pPr>
       <w:r>
         <w:rPr>
@@ -4269,7 +4218,6 @@
     <w:p>
       <w:pPr>
         <w:pStyle w:val="BodyText"/>
-        <w:jc w:val="both"/>
       </w:pPr>
       <w:r>
         <w:rPr>
@@ -4381,7 +4329,6 @@
     <w:p>
       <w:pPr>
         <w:pStyle w:val="BodyText"/>
-        <w:jc w:val="both"/>
       </w:pPr>
       <w:r>
         <w:rPr>
@@ -4437,7 +4384,6 @@
     <w:p>
       <w:pPr>
         <w:pStyle w:val="BodyText"/>
-        <w:jc w:val="both"/>
       </w:pPr>
       <w:r>
         <w:rPr>
@@ -4510,7 +4456,6 @@
     <w:p>
       <w:pPr>
         <w:pStyle w:val="BodyText"/>
-        <w:jc w:val="both"/>
       </w:pPr>
       <w:r>
         <w:rPr>
@@ -4590,7 +4535,6 @@
     <w:p>
       <w:pPr>
         <w:pStyle w:val="FirstParagraph"/>
-        <w:jc w:val="both"/>
       </w:pPr>
       <w:r>
         <w:t xml:space="preserve">What, then, individuates an ideology? Not its doctrinal body, which migrates and undergoes revision; not the arrangement of its concepts alone, which remains internal to what it says; not the distribution of its attention alone, which opposite formations can share; but the pair ⟨ω, chain⟩: where a family spends its hermeneutic budget, and what it does to the topology of the questions it did not author. The criterion is grid-relative, comparative, and estimable, and its objects — weights and operators — are not constructions of the analyst but traces that the operation leaves because it acts on a material that precedes it.</w:t>
@@ -4599,7 +4543,6 @@
     <w:p>
       <w:pPr>
         <w:pStyle w:val="BodyText"/>
-        <w:jc w:val="both"/>
       </w:pPr>
       <w:r>
         <w:t xml:space="preserve">It is worth stating, in closing, what has been argued and what has not. Argued: that the doctrinal and morphological criteria underdetermine identity, and that a grid-relative criterion does not; that the operators are species of decontestation with specifiable mechanisms, and that a signature constrains through the norm circles that back it and the telic power of its ideals; that the strata are regimes of constraint rather than entities, and that the account survives the fictionalist’s and the naturalist’s objections at that price; that the signature is the pair and not one of its members. Proposed: the matrix, the bound on ω, the six operators, the estimation protocol. Conjectured: the ten signatures of Table 3, the polarity of fascism and feminisms, the compatibility of the revelation operators with every host. The function that defines an ideology — selection and weighting over the grid — individuates what kind of thing an ideology is; it does not predict which signature a given lineage will have, and no theoretical argument can (Larue 2025, 233, 237). That is what the protocol is for.</w:t>
@@ -4608,7 +4551,6 @@
     <w:p>
       <w:pPr>
         <w:pStyle w:val="BodyText"/>
-        <w:jc w:val="both"/>
       </w:pPr>
       <w:r>
         <w:t xml:space="preserve">The most general result concerns conflict. If ideologies were different answers to the same questions, ideological conflict would in principle be composable by argument. The signatures show otherwise: ideologies do not clash primarily over answers — they clash over the topology of the matrix, over which questions exist, which are one and the same, which are resolved by nature, and which must not be posed. Whoever has translated a question cannot discuss it in its original form; whoever has naturalized it no longer sees it as a question; whoever has silenced it lacks the grammar to receive it. Arguing presupposes sharing the question, and it is precisely the question that signatures do not share. Hence the rarely argumentative character of ideological struggle, and its typical forms: not refutation, but revelation — reopening a cell — or conversion — changing chains. Ideological conflict is, at its deepest stratum, a conflict over the topology of the discussable; a theory that makes it estimable does not dissolve it, but it makes it recognizable for what it is.</w:t>
@@ -4627,7 +4569,6 @@
     <w:p>
       <w:pPr>
         <w:pStyle w:val="FirstParagraph"/>
-        <w:jc w:val="both"/>
       </w:pPr>
       <w:r>
         <w:t xml:space="preserve">C1–C5: the five existential conflicts (survival, belonging, order, meaning, transformation). S1–S4: the four social subsystems (biological, economic, political, cultural). M = C × S: the matrix of twenty cells (i, j). ω: the weighting function of a formation over the cells, Σ ω_ij = 1. ⇒ translation; ⊕ fusion; ↓ S naturalization (toward subsystem S); ∅ silencing; ✦ revelation; ∥ scission. ⟨ω, chain⟩: the signature of a family (weighting and operator chain). I = ⟨C, S, D, G, B, A, P, V, I, O, M⟩: Romero’s belief field (community, society, domain, worldview, background knowledge, doctrinal body with core A_core, problems, values, ideals, objectives, methods).</w:t>
@@ -4646,7 +4587,6 @@
     <w:p>
       <w:pPr>
         <w:pStyle w:val="FirstParagraph"/>
-        <w:jc w:val="both"/>
       </w:pPr>
       <w:r>
         <w:t xml:space="preserve">Arendt, Hannah. 1958.</w:t>
@@ -4668,7 +4608,6 @@
     <w:p>
       <w:pPr>
         <w:pStyle w:val="BodyText"/>
-        <w:jc w:val="both"/>
       </w:pPr>
       <w:r>
         <w:t xml:space="preserve">Bach, Theodore. 2016.</w:t>
@@ -4705,7 +4644,6 @@
     <w:p>
       <w:pPr>
         <w:pStyle w:val="BodyText"/>
-        <w:jc w:val="both"/>
       </w:pPr>
       <w:r>
         <w:t xml:space="preserve">Barthes, Roland. 1957.</w:t>
@@ -4727,7 +4665,6 @@
     <w:p>
       <w:pPr>
         <w:pStyle w:val="BodyText"/>
-        <w:jc w:val="both"/>
       </w:pPr>
       <w:r>
         <w:t xml:space="preserve">Bourdieu, Pierre. 1980.</w:t>
@@ -4749,7 +4686,6 @@
     <w:p>
       <w:pPr>
         <w:pStyle w:val="BodyText"/>
-        <w:jc w:val="both"/>
       </w:pPr>
       <w:r>
         <w:t xml:space="preserve">Bourguet González, Luis Felipe. Under review.</w:t>
@@ -4789,7 +4725,6 @@
     <w:p>
       <w:pPr>
         <w:pStyle w:val="BodyText"/>
-        <w:jc w:val="both"/>
       </w:pPr>
       <w:r>
         <w:t xml:space="preserve">Brännmark, Johan. 2026.</w:t>
@@ -4826,7 +4761,6 @@
     <w:p>
       <w:pPr>
         <w:pStyle w:val="BodyText"/>
-        <w:jc w:val="both"/>
       </w:pPr>
       <w:r>
         <w:t xml:space="preserve">Bunge, Mario. 1979.</w:t>
@@ -4861,7 +4795,6 @@
     <w:p>
       <w:pPr>
         <w:pStyle w:val="BodyText"/>
-        <w:jc w:val="both"/>
       </w:pPr>
       <w:r>
         <w:t xml:space="preserve">Burman, Åsa. 2023.</w:t>
@@ -4883,7 +4816,6 @@
     <w:p>
       <w:pPr>
         <w:pStyle w:val="BodyText"/>
-        <w:jc w:val="both"/>
       </w:pPr>
       <w:r>
         <w:t xml:space="preserve">Cassirer, Ernst. 1923–1929.</w:t>
@@ -4905,7 +4837,6 @@
     <w:p>
       <w:pPr>
         <w:pStyle w:val="BodyText"/>
-        <w:jc w:val="both"/>
       </w:pPr>
       <w:r>
         <w:t xml:space="preserve">Castoriadis, Cornelius. 1975.</w:t>
@@ -4927,7 +4858,6 @@
     <w:p>
       <w:pPr>
         <w:pStyle w:val="BodyText"/>
-        <w:jc w:val="both"/>
       </w:pPr>
       <w:r>
         <w:t xml:space="preserve">De Cleen, Benjamin. 2018.</w:t>
@@ -4964,7 +4894,6 @@
     <w:p>
       <w:pPr>
         <w:pStyle w:val="BodyText"/>
-        <w:jc w:val="both"/>
       </w:pPr>
       <w:r>
         <w:t xml:space="preserve">Elder-Vass, Dave. 2015.</w:t>
@@ -5001,7 +4930,6 @@
     <w:p>
       <w:pPr>
         <w:pStyle w:val="BodyText"/>
-        <w:jc w:val="both"/>
       </w:pPr>
       <w:r>
         <w:t xml:space="preserve">Epstein, Brian. 2015.</w:t>
@@ -5023,7 +4951,6 @@
     <w:p>
       <w:pPr>
         <w:pStyle w:val="BodyText"/>
-        <w:jc w:val="both"/>
       </w:pPr>
       <w:r>
         <w:t xml:space="preserve">Epstein, Brian. 2016.</w:t>
@@ -5088,7 +5015,6 @@
     <w:p>
       <w:pPr>
         <w:pStyle w:val="BodyText"/>
-        <w:jc w:val="both"/>
       </w:pPr>
       <w:r>
         <w:t xml:space="preserve">Ferraris, Maurizio. 2012.</w:t>
@@ -5110,7 +5036,6 @@
     <w:p>
       <w:pPr>
         <w:pStyle w:val="BodyText"/>
-        <w:jc w:val="both"/>
       </w:pPr>
       <w:r>
         <w:t xml:space="preserve">Ferraris, Maurizio. 2016.</w:t>
@@ -5132,7 +5057,6 @@
     <w:p>
       <w:pPr>
         <w:pStyle w:val="BodyText"/>
-        <w:jc w:val="both"/>
       </w:pPr>
       <w:r>
         <w:t xml:space="preserve">Franks, Benjamin. 2016.</w:t>
@@ -5169,7 +5093,6 @@
     <w:p>
       <w:pPr>
         <w:pStyle w:val="BodyText"/>
-        <w:jc w:val="both"/>
       </w:pPr>
       <w:r>
         <w:t xml:space="preserve">Freeden, Michael. 1996.</w:t>
@@ -5191,7 +5114,6 @@
     <w:p>
       <w:pPr>
         <w:pStyle w:val="BodyText"/>
-        <w:jc w:val="both"/>
       </w:pPr>
       <w:r>
         <w:t xml:space="preserve">Freeden, Michael. 1998.</w:t>
@@ -5228,7 +5150,6 @@
     <w:p>
       <w:pPr>
         <w:pStyle w:val="BodyText"/>
-        <w:jc w:val="both"/>
       </w:pPr>
       <w:r>
         <w:t xml:space="preserve">Geertz, Clifford. 1973.</w:t>
@@ -5250,7 +5171,6 @@
     <w:p>
       <w:pPr>
         <w:pStyle w:val="BodyText"/>
-        <w:jc w:val="both"/>
       </w:pPr>
       <w:r>
         <w:t xml:space="preserve">Gramsci, Antonio. 1975.</w:t>
@@ -5272,7 +5192,6 @@
     <w:p>
       <w:pPr>
         <w:pStyle w:val="BodyText"/>
-        <w:jc w:val="both"/>
       </w:pPr>
       <w:r>
         <w:t xml:space="preserve">Grimmer, Justin, and Brandon M. Stewart. 2013.</w:t>
@@ -5309,7 +5228,6 @@
     <w:p>
       <w:pPr>
         <w:pStyle w:val="BodyText"/>
-        <w:jc w:val="both"/>
       </w:pPr>
       <w:r>
         <w:t xml:space="preserve">Gulì, Sandro, and Luca Moretti. 2025.</w:t>
@@ -5346,7 +5264,6 @@
     <w:p>
       <w:pPr>
         <w:pStyle w:val="BodyText"/>
-        <w:jc w:val="both"/>
       </w:pPr>
       <w:r>
         <w:t xml:space="preserve">Hacking, Ian. 1995.</w:t>
@@ -5386,7 +5303,6 @@
     <w:p>
       <w:pPr>
         <w:pStyle w:val="BodyText"/>
-        <w:jc w:val="both"/>
       </w:pPr>
       <w:r>
         <w:t xml:space="preserve">Humphrey, Mathew. 2000.</w:t>
@@ -5435,7 +5351,6 @@
     <w:p>
       <w:pPr>
         <w:pStyle w:val="BodyText"/>
-        <w:jc w:val="both"/>
       </w:pPr>
       <w:r>
         <w:t xml:space="preserve">Kaidesoja, Tuukka. 2015.</w:t>
@@ -5485,7 +5400,6 @@
     <w:p>
       <w:pPr>
         <w:pStyle w:val="BodyText"/>
-        <w:jc w:val="both"/>
       </w:pPr>
       <w:r>
         <w:t xml:space="preserve">Kofoed Hansen, Christian. 2026.</w:t>
@@ -5519,7 +5433,6 @@
     <w:p>
       <w:pPr>
         <w:pStyle w:val="BodyText"/>
-        <w:jc w:val="both"/>
       </w:pPr>
       <w:r>
         <w:t xml:space="preserve">Langer, Susanne K. 1942.</w:t>
@@ -5541,7 +5454,6 @@
     <w:p>
       <w:pPr>
         <w:pStyle w:val="BodyText"/>
-        <w:jc w:val="both"/>
       </w:pPr>
       <w:r>
         <w:t xml:space="preserve">Jankowski, Michael, Sebastian Schneider, and Markus Tepe. 2023.</w:t>
@@ -5611,7 +5523,6 @@
     <w:p>
       <w:pPr>
         <w:pStyle w:val="BodyText"/>
-        <w:jc w:val="both"/>
       </w:pPr>
       <w:r>
         <w:t xml:space="preserve">Larue, Louis. 2025.</w:t>
@@ -5648,7 +5559,6 @@
     <w:p>
       <w:pPr>
         <w:pStyle w:val="BodyText"/>
-        <w:jc w:val="both"/>
       </w:pPr>
       <w:r>
         <w:t xml:space="preserve">Laver, Michael, Kenneth Benoit, and John Garry. 2003.</w:t>
@@ -5685,7 +5595,6 @@
     <w:p>
       <w:pPr>
         <w:pStyle w:val="BodyText"/>
-        <w:jc w:val="both"/>
       </w:pPr>
       <w:r>
         <w:t xml:space="preserve">Levine, Peter. 2024.</w:t>
@@ -5722,7 +5631,6 @@
     <w:p>
       <w:pPr>
         <w:pStyle w:val="BodyText"/>
-        <w:jc w:val="both"/>
       </w:pPr>
       <w:r>
         <w:t xml:space="preserve">Malinowski, Bronisław. 1944.</w:t>
@@ -5744,7 +5652,6 @@
     <w:p>
       <w:pPr>
         <w:pStyle w:val="BodyText"/>
-        <w:jc w:val="both"/>
       </w:pPr>
       <w:r>
         <w:t xml:space="preserve">Onnis, Erica. 2021.</w:t>
@@ -5766,7 +5673,6 @@
     <w:p>
       <w:pPr>
         <w:pStyle w:val="BodyText"/>
-        <w:jc w:val="both"/>
       </w:pPr>
       <w:r>
         <w:t xml:space="preserve">Ostrowski, Marius S. 2023.</w:t>
@@ -5803,7 +5709,6 @@
     <w:p>
       <w:pPr>
         <w:pStyle w:val="BodyText"/>
-        <w:jc w:val="both"/>
       </w:pPr>
       <w:r>
         <w:t xml:space="preserve">Ostrowski, Marius S. 2025.</w:t>
@@ -5840,7 +5745,6 @@
     <w:p>
       <w:pPr>
         <w:pStyle w:val="BodyText"/>
-        <w:jc w:val="both"/>
       </w:pPr>
       <w:r>
         <w:t xml:space="preserve">Ostrowski, Marius S. 2026.</w:t>
@@ -5877,7 +5781,6 @@
     <w:p>
       <w:pPr>
         <w:pStyle w:val="BodyText"/>
-        <w:jc w:val="both"/>
       </w:pPr>
       <w:r>
         <w:t xml:space="preserve">Peirce, Charles S. 1992.</w:t>
@@ -5899,7 +5802,6 @@
     <w:p>
       <w:pPr>
         <w:pStyle w:val="BodyText"/>
-        <w:jc w:val="both"/>
       </w:pPr>
       <w:r>
         <w:t xml:space="preserve">Romero, Gustavo E. 2025.</w:t>
@@ -5939,7 +5841,6 @@
     <w:p>
       <w:pPr>
         <w:pStyle w:val="BodyText"/>
-        <w:jc w:val="both"/>
       </w:pPr>
       <w:r>
         <w:t xml:space="preserve">Simon, Herbert A. 1971.</w:t>
@@ -5979,7 +5880,6 @@
     <w:p>
       <w:pPr>
         <w:pStyle w:val="BodyText"/>
-        <w:jc w:val="both"/>
       </w:pPr>
       <w:r>
         <w:t xml:space="preserve">Stanley, Ben. 2008.</w:t>
@@ -6016,7 +5916,6 @@
     <w:p>
       <w:pPr>
         <w:pStyle w:val="BodyText"/>
-        <w:jc w:val="both"/>
       </w:pPr>
       <w:r>
         <w:t xml:space="preserve">Sucaet, Peter. 2026.</w:t>
@@ -6053,7 +5952,6 @@
     <w:p>
       <w:pPr>
         <w:pStyle w:val="BodyText"/>
-        <w:jc w:val="both"/>
       </w:pPr>
       <w:r>
         <w:t xml:space="preserve">Turunen, Risto. 2026.</w:t>
@@ -6090,7 +5988,6 @@
     <w:p>
       <w:pPr>
         <w:pStyle w:val="BodyText"/>
-        <w:jc w:val="both"/>
       </w:pPr>
       <w:r>
         <w:t xml:space="preserve">Wilson, Lee. 2021.</w:t>
@@ -6127,7 +6024,6 @@
     <w:p>
       <w:pPr>
         <w:pStyle w:val="BodyText"/>
-        <w:jc w:val="both"/>
       </w:pPr>
       <w:r>
         <w:t xml:space="preserve">Wimsatt, William C. 2007.</w:t>
@@ -6339,7 +6235,7 @@
         <w:color w:val="C8521E"/>
         <w:sz w:val="16"/>
       </w:rPr>
-      <w:t>PREPRINT · not peer reviewed · submitted to the Journal of Social Ontology, October 2026</w:t>
+      <w:t>PREPRINT · not peer reviewed · submitted to the Journal of Social Ontology, October 2026 · doi:10.5281/zenodo.23387760</w:t>
     </w:r>
   </w:p>
 </w:hdr>

</xml_diff>

<commit_message>
v1.0.2: withhold the name of the reviewing journal (double-anonymous review)
Banner, running header, status note, README, .zenodo.json (description, notes, version 1.0.2) and CITATION.cff no longer name the journal while the manuscript is under review. Text of the preprint unchanged; author/affiliation lines left-aligned.
</commit_message>
<xml_diff>
--- a/Bourguet_2026_Ideological_Signatures_preprint_v1.docx
+++ b/Bourguet_2026_Ideological_Signatures_preprint_v1.docx
@@ -21,7 +21,7 @@
           <w:color w:val="C8521E"/>
           <w:sz w:val="20"/>
         </w:rPr>
-        <w:t>PREPRINT — VERSION 1 (15 OCTOBER 2026) — SUBMITTED TO THE JOURNAL OF SOCIAL ONTOLOGY — NOT YET PEER REVIEWED — CC BY 4.0 — DOI 10.5281/zenodo.23387760</w:t>
+        <w:t>PREPRINT — VERSION 1 (15 OCTOBER 2026) — UNDER PEER REVIEW (VENUE WITHHELD) — NOT YET PEER REVIEWED — CC BY 4.0 — DOI 10.5281/zenodo.23387760</w:t>
       </w:r>
     </w:p>
     <w:p>
@@ -39,6 +39,7 @@
     <w:p>
       <w:pPr>
         <w:pStyle w:val="BodyText"/>
+        <w:jc w:val="left"/>
       </w:pPr>
       <w:r>
         <w:t xml:space="preserve">Luis Felipe Bourguet González</w:t>
@@ -65,49 +66,43 @@
           <w:iCs/>
           <w:i/>
         </w:rPr>
-        <w:t xml:space="preserve">Preprint, version 1 (October 15, 2026). This manuscript has been submitted for peer review to the Journal of Social Ontology. It has not yet been peer reviewed. Licensed under CC BY 4.0. Please cite as: Bourguet González, L. F. 2026.</w:t>
-      </w:r>
-      <w:r>
-        <w:rPr>
-          <w:iCs/>
-          <w:i/>
-        </w:rPr>
-        <w:t xml:space="preserve"> </w:t>
-      </w:r>
-      <w:r>
-        <w:rPr>
-          <w:iCs/>
-          <w:i/>
-        </w:rPr>
-        <w:t xml:space="preserve">“</w:t>
-      </w:r>
-      <w:r>
-        <w:rPr>
-          <w:iCs/>
-          <w:i/>
-        </w:rPr>
-        <w:t xml:space="preserve">Ideological Signatures: A Grid-Relative Criterion for the Individuation of Ideologies.</w:t>
-      </w:r>
-      <w:r>
-        <w:rPr>
-          <w:iCs/>
-          <w:i/>
-        </w:rPr>
-        <w:t xml:space="preserve">”</w:t>
-      </w:r>
-      <w:r>
-        <w:rPr>
-          <w:iCs/>
-          <w:i/>
-        </w:rPr>
-        <w:t xml:space="preserve"> </w:t>
-      </w:r>
-      <w:r>
-        <w:rPr>
-          <w:iCs/>
-          <w:i/>
-        </w:rPr>
-        <w:t xml:space="preserve">Preprint. Zenodo. https://doi.org/10.5281/zenodo.23387760.</w:t>
+        <w:t>Preprint, version 1 (October 15, 2026). This manuscript is under double-anonymous peer review at a journal (venue withheld until decision). It has not yet been peer reviewed. Licensed under CC BY 4.0. Please cite as: Bourguet González, L. F. 2026. “Ideological Signatures: A Grid-Relative Criterion for the Individuation of Ideologies.” Preprint. Zenodo. https://doi.org/10.5281/zenodo.23387760.</w:t>
+      </w:r>
+      <w:r>
+        <w:rPr>
+          <w:iCs/>
+          <w:i/>
+        </w:rPr>
+      </w:r>
+      <w:r>
+        <w:rPr>
+          <w:iCs/>
+          <w:i/>
+        </w:rPr>
+      </w:r>
+      <w:r>
+        <w:rPr>
+          <w:iCs/>
+          <w:i/>
+        </w:rPr>
+      </w:r>
+      <w:r>
+        <w:rPr>
+          <w:iCs/>
+          <w:i/>
+        </w:rPr>
+      </w:r>
+      <w:r>
+        <w:rPr>
+          <w:iCs/>
+          <w:i/>
+        </w:rPr>
+      </w:r>
+      <w:r>
+        <w:rPr>
+          <w:iCs/>
+          <w:i/>
+        </w:rPr>
       </w:r>
     </w:p>
     <w:p>
@@ -6046,6 +6041,7 @@
     <w:sectPr>
       <w:footerReference r:id="rId9" w:type="default"/>
       <w:headerReference w:type="default" r:id="rId10"/>
+      <w:headerReference w:type="first" r:id="rId11"/>
     </w:sectPr>
   </w:body>
 </w:document>
@@ -6228,15 +6224,26 @@
       <w:pStyle w:val="Header"/>
       <w:jc w:val="right"/>
     </w:pPr>
-    <w:r/>
+    <w:r>
+      <w:t>PREPRINT · under peer review, not yet peer reviewed · October 2026 · doi:10.5281/zenodo.23387760</w:t>
+    </w:r>
     <w:r>
       <w:rPr>
         <w:rFonts w:ascii="Times New Roman" w:hAnsi="Times New Roman"/>
         <w:color w:val="C8521E"/>
         <w:sz w:val="16"/>
       </w:rPr>
-      <w:t>PREPRINT · not peer reviewed · submitted to the Journal of Social Ontology, October 2026 · doi:10.5281/zenodo.23387760</w:t>
     </w:r>
+  </w:p>
+</w:hdr>
+</file>
+
+<file path=word/header2.xml><?xml version="1.0" encoding="utf-8"?>
+<w:hdr xmlns:m="http://schemas.openxmlformats.org/officeDocument/2006/math" xmlns:mc="http://schemas.openxmlformats.org/markup-compatibility/2006" xmlns:mo="http://schemas.microsoft.com/office/mac/office/2008/main" xmlns:mv="urn:schemas-microsoft-com:mac:vml" xmlns:o="urn:schemas-microsoft-com:office:office" xmlns:r="http://schemas.openxmlformats.org/officeDocument/2006/relationships" xmlns:v="urn:schemas-microsoft-com:vml" xmlns:w10="urn:schemas-microsoft-com:office:word" xmlns:w14="http://schemas.microsoft.com/office/word/2010/wordml" xmlns:w="http://schemas.openxmlformats.org/wordprocessingml/2006/main" xmlns:wne="http://schemas.microsoft.com/office/word/2006/wordml" xmlns:wp14="http://schemas.microsoft.com/office/word/2010/wordprocessingDrawing" xmlns:wp="http://schemas.openxmlformats.org/drawingml/2006/wordprocessingDrawing" xmlns:wpc="http://schemas.microsoft.com/office/word/2010/wordprocessingCanvas" xmlns:wpg="http://schemas.microsoft.com/office/word/2010/wordprocessingGroup" xmlns:wpi="http://schemas.microsoft.com/office/word/2010/wordprocessingInk" xmlns:wps="http://schemas.microsoft.com/office/word/2010/wordprocessingShape" mc:Ignorable="w14 wp14">
+  <w:p>
+    <w:pPr>
+      <w:pStyle w:val="Header"/>
+    </w:pPr>
   </w:p>
 </w:hdr>
 </file>

</xml_diff>